<commit_message>
test: shorten the text-direction lines so each edge is readable
A line that fills the measure sits against both edges, which is the one
thing these fixtures are for. Adds the alignments that were missing:
`justify` and an unaligned `rl-tb` paragraph on the odt side, `right` and
a `w:bidi="0"` + `w:jc="start"` paragraph on the docx side.

Co-Authored-By: Claude Opus 5 (1M context) <noreply@anthropic.com>
Claude-Session: https://claude.ai/code/session_01TP23uvwVtgEzZZTJnWsJC2
</commit_message>
<xml_diff>
--- a/docx/text-direction.docx
+++ b/docx/text-direction.docx
@@ -7,7 +7,7 @@
         <w:bidi/>
       </w:pPr>
       <w:r>
-        <w:t xml:space="preserve">inherits w:bidi: مرحبا بالعالم and latin 123</w:t>
+        <w:t xml:space="preserve">unaligned مرحبا بالعالم 123</w:t>
       </w:r>
     </w:p>
     <w:p>
@@ -16,7 +16,7 @@
         <w:jc w:val="start"/>
       </w:pPr>
       <w:r>
-        <w:t xml:space="preserve">w:bidi + w:jc=start renders right: مرحبا بالعالم</w:t>
+        <w:t xml:space="preserve">start</w:t>
       </w:r>
     </w:p>
     <w:p>
@@ -25,7 +25,7 @@
         <w:jc w:val="end"/>
       </w:pPr>
       <w:r>
-        <w:t xml:space="preserve">w:bidi + w:jc=end renders left: مرحبا بالعالم</w:t>
+        <w:t xml:space="preserve">end</w:t>
       </w:r>
     </w:p>
     <w:p>
@@ -34,7 +34,16 @@
         <w:jc w:val="left"/>
       </w:pPr>
       <w:r>
-        <w:t xml:space="preserve">w:bidi + w:jc=left renders left</w:t>
+        <w:t xml:space="preserve">left</w:t>
+      </w:r>
+    </w:p>
+    <w:p>
+      <w:pPr>
+        <w:bidi/>
+        <w:jc w:val="right"/>
+      </w:pPr>
+      <w:r>
+        <w:t xml:space="preserve">right</w:t>
       </w:r>
     </w:p>
     <w:p>
@@ -43,7 +52,7 @@
         <w:jc w:val="center"/>
       </w:pPr>
       <w:r>
-        <w:t xml:space="preserve">w:bidi + w:jc=center</w:t>
+        <w:t xml:space="preserve">center</w:t>
       </w:r>
     </w:p>
     <w:p>
@@ -51,7 +60,16 @@
         <w:bidi w:val="0"/>
       </w:pPr>
       <w:r>
-        <w:t xml:space="preserve">w:bidi=0: مرحبا بالعالم and latin 123</w:t>
+        <w:t xml:space="preserve">bidi-off مرحبا بالعالم 123</w:t>
+      </w:r>
+    </w:p>
+    <w:p>
+      <w:pPr>
+        <w:bidi w:val="0"/>
+        <w:jc w:val="start"/>
+      </w:pPr>
+      <w:r>
+        <w:t xml:space="preserve">bidi-off start</w:t>
       </w:r>
     </w:p>
     <w:sectPr>

</xml_diff>